<commit_message>
Adding Exam1 and Exam1_Answer
</commit_message>
<xml_diff>
--- a/Git_Exam/Exam1/Exam1_Answer.docx
+++ b/Git_Exam/Exam1/Exam1_Answer.docx
@@ -5,19 +5,12 @@
     <w:p>
       <w:pPr>
         <w:rPr>
-          <w:sz w:val="28"/>
-          <w:szCs w:val="28"/>
-        </w:rPr>
-      </w:pPr>
-      <w:r>
-        <w:rPr>
           <w:b/>
           <w:bCs/>
           <w:sz w:val="36"/>
           <w:szCs w:val="36"/>
         </w:rPr>
-        <w:t>Lời giải Exam 1</w:t>
-      </w:r>
+      </w:pPr>
       <w:r>
         <w:rPr>
           <w:b/>
@@ -25,6 +18,45 @@
           <w:sz w:val="36"/>
           <w:szCs w:val="36"/>
         </w:rPr>
+        <w:t>Lời giải Exam 1</w:t>
+      </w:r>
+      <w:r>
+        <w:rPr>
+          <w:b/>
+          <w:bCs/>
+          <w:sz w:val="36"/>
+          <w:szCs w:val="36"/>
+        </w:rPr>
+        <w:br/>
+      </w:r>
+      <w:r>
+        <w:rPr>
+          <w:sz w:val="28"/>
+          <w:szCs w:val="28"/>
+        </w:rPr>
+        <w:t xml:space="preserve">bài </w:t>
+      </w:r>
+      <w:r>
+        <w:rPr>
+          <w:sz w:val="28"/>
+          <w:szCs w:val="28"/>
+        </w:rPr>
+        <w:t>1: Khởi tạo Repository</w:t>
+      </w:r>
+      <w:r>
+        <w:rPr>
+          <w:sz w:val="28"/>
+          <w:szCs w:val="28"/>
+        </w:rPr>
+        <w:t>, Quản lý commit và theo dõi lịch sử</w:t>
+      </w:r>
+      <w:r>
+        <w:rPr>
+          <w:b/>
+          <w:bCs/>
+          <w:sz w:val="36"/>
+          <w:szCs w:val="36"/>
+        </w:rPr>
         <w:br/>
       </w:r>
       <w:r>
@@ -76,14 +108,7 @@
           <w:sz w:val="28"/>
           <w:szCs w:val="28"/>
         </w:rPr>
-        <w:t xml:space="preserve"> </w:t>
-      </w:r>
-      <w:r>
-        <w:rPr>
-          <w:sz w:val="28"/>
-          <w:szCs w:val="28"/>
-        </w:rPr>
-        <w:t>Tạo file đầu tiên và Commit lần 1</w:t>
+        <w:t xml:space="preserve"> Tạo file đầu tiên và Commit lần 1</w:t>
       </w:r>
       <w:r>
         <w:rPr>
@@ -164,14 +189,7 @@
           <w:sz w:val="28"/>
           <w:szCs w:val="28"/>
         </w:rPr>
-        <w:t xml:space="preserve">c) </w:t>
-      </w:r>
-      <w:r>
-        <w:rPr>
-          <w:sz w:val="28"/>
-          <w:szCs w:val="28"/>
-        </w:rPr>
-        <w:t>Chỉnh sửa và Commit lần 2</w:t>
+        <w:t>c) Chỉnh sửa và Commit lần 2</w:t>
       </w:r>
       <w:r>
         <w:rPr>

</xml_diff>